<commit_message>
Retomando ejercicios de SQL con postgres + VSC
</commit_message>
<xml_diff>
--- a/documentos/Documentacion teorica.docx
+++ b/documentos/Documentacion teorica.docx
@@ -698,8 +698,6 @@
         </w:rPr>
         <w:t>:</w:t>
       </w:r>
-      <w:bookmarkStart w:id="0" w:name="_GoBack"/>
-      <w:bookmarkEnd w:id="0"/>
     </w:p>
     <w:p>
       <w:pPr>
@@ -1048,13 +1046,7 @@
         <w:rPr>
           <w:rFonts w:ascii="Times New Roman" w:hAnsi="Times New Roman" w:cs="Times New Roman"/>
         </w:rPr>
-        <w:t xml:space="preserve"> </w:t>
-      </w:r>
-      <w:r>
-        <w:rPr>
-          <w:rFonts w:ascii="Times New Roman" w:hAnsi="Times New Roman" w:cs="Times New Roman"/>
-        </w:rPr>
-        <w:t>control de transacciones</w:t>
+        <w:t xml:space="preserve"> control de transacciones</w:t>
       </w:r>
     </w:p>
     <w:p>
@@ -3378,6 +3370,389 @@
           <w:lang w:val="en-US"/>
         </w:rPr>
         <w:t>SUBSTRING(last_name,1,2)</w:t>
+      </w:r>
+    </w:p>
+    <w:p>
+      <w:pPr>
+        <w:spacing w:after="0" w:line="360" w:lineRule="auto"/>
+        <w:jc w:val="both"/>
+        <w:rPr>
+          <w:rFonts w:ascii="Times New Roman" w:hAnsi="Times New Roman" w:cs="Times New Roman"/>
+          <w:lang w:val="en-US"/>
+        </w:rPr>
+      </w:pPr>
+    </w:p>
+    <w:p>
+      <w:pPr>
+        <w:pStyle w:val="Prrafodelista"/>
+        <w:numPr>
+          <w:ilvl w:val="0"/>
+          <w:numId w:val="7"/>
+        </w:numPr>
+        <w:spacing w:after="0" w:line="360" w:lineRule="auto"/>
+        <w:jc w:val="both"/>
+        <w:rPr>
+          <w:rFonts w:ascii="Times New Roman" w:hAnsi="Times New Roman" w:cs="Times New Roman"/>
+          <w:lang w:val="es-AR"/>
+        </w:rPr>
+      </w:pPr>
+      <w:r>
+        <w:rPr>
+          <w:rFonts w:ascii="Times New Roman" w:hAnsi="Times New Roman" w:cs="Times New Roman"/>
+          <w:lang w:val="es-AR"/>
+        </w:rPr>
+        <w:t xml:space="preserve">Aspectos a tener </w:t>
+      </w:r>
+      <w:proofErr w:type="spellStart"/>
+      <w:r>
+        <w:rPr>
+          <w:rFonts w:ascii="Times New Roman" w:hAnsi="Times New Roman" w:cs="Times New Roman"/>
+          <w:lang w:val="es-AR"/>
+        </w:rPr>
+        <w:t>e</w:t>
+      </w:r>
+      <w:proofErr w:type="spellEnd"/>
+      <w:r>
+        <w:rPr>
+          <w:rFonts w:ascii="Times New Roman" w:hAnsi="Times New Roman" w:cs="Times New Roman"/>
+          <w:lang w:val="es-AR"/>
+        </w:rPr>
+        <w:t xml:space="preserve"> cuenta para limpiar unta </w:t>
+      </w:r>
+      <w:proofErr w:type="spellStart"/>
+      <w:r>
+        <w:rPr>
+          <w:rFonts w:ascii="Times New Roman" w:hAnsi="Times New Roman" w:cs="Times New Roman"/>
+          <w:lang w:val="es-AR"/>
+        </w:rPr>
+        <w:t>table</w:t>
+      </w:r>
+      <w:proofErr w:type="spellEnd"/>
+      <w:r>
+        <w:rPr>
+          <w:rFonts w:ascii="Times New Roman" w:hAnsi="Times New Roman" w:cs="Times New Roman"/>
+          <w:lang w:val="es-AR"/>
+        </w:rPr>
+        <w:t xml:space="preserve"> en SQL:</w:t>
+      </w:r>
+    </w:p>
+    <w:p>
+      <w:pPr>
+        <w:pStyle w:val="Prrafodelista"/>
+        <w:numPr>
+          <w:ilvl w:val="0"/>
+          <w:numId w:val="7"/>
+        </w:numPr>
+        <w:spacing w:after="0" w:line="360" w:lineRule="auto"/>
+        <w:jc w:val="both"/>
+        <w:rPr>
+          <w:rFonts w:ascii="Times New Roman" w:hAnsi="Times New Roman" w:cs="Times New Roman"/>
+          <w:lang w:val="es-AR"/>
+        </w:rPr>
+      </w:pPr>
+      <w:r>
+        <w:rPr>
+          <w:rFonts w:ascii="Times New Roman" w:hAnsi="Times New Roman" w:cs="Times New Roman"/>
+          <w:lang w:val="es-AR"/>
+        </w:rPr>
+        <w:t>Obtener filas duplicadas.</w:t>
+      </w:r>
+    </w:p>
+    <w:p>
+      <w:pPr>
+        <w:pStyle w:val="Prrafodelista"/>
+        <w:numPr>
+          <w:ilvl w:val="0"/>
+          <w:numId w:val="7"/>
+        </w:numPr>
+        <w:spacing w:after="0" w:line="360" w:lineRule="auto"/>
+        <w:jc w:val="both"/>
+        <w:rPr>
+          <w:rFonts w:ascii="Times New Roman" w:hAnsi="Times New Roman" w:cs="Times New Roman"/>
+          <w:lang w:val="es-AR"/>
+        </w:rPr>
+      </w:pPr>
+      <w:r>
+        <w:rPr>
+          <w:rFonts w:ascii="Times New Roman" w:hAnsi="Times New Roman" w:cs="Times New Roman"/>
+          <w:lang w:val="es-AR"/>
+        </w:rPr>
+        <w:t xml:space="preserve">Limpiar espacios con </w:t>
+      </w:r>
+      <w:proofErr w:type="gramStart"/>
+      <w:r>
+        <w:rPr>
+          <w:rFonts w:ascii="Times New Roman" w:hAnsi="Times New Roman" w:cs="Times New Roman"/>
+          <w:lang w:val="es-AR"/>
+        </w:rPr>
+        <w:t>TRIM(</w:t>
+      </w:r>
+      <w:proofErr w:type="gramEnd"/>
+      <w:r>
+        <w:rPr>
+          <w:rFonts w:ascii="Times New Roman" w:hAnsi="Times New Roman" w:cs="Times New Roman"/>
+          <w:lang w:val="es-AR"/>
+        </w:rPr>
+        <w:t>).</w:t>
+      </w:r>
+    </w:p>
+    <w:p>
+      <w:pPr>
+        <w:pStyle w:val="Prrafodelista"/>
+        <w:numPr>
+          <w:ilvl w:val="0"/>
+          <w:numId w:val="7"/>
+        </w:numPr>
+        <w:spacing w:after="0" w:line="360" w:lineRule="auto"/>
+        <w:jc w:val="both"/>
+        <w:rPr>
+          <w:rFonts w:ascii="Times New Roman" w:hAnsi="Times New Roman" w:cs="Times New Roman"/>
+          <w:lang w:val="es-AR"/>
+        </w:rPr>
+      </w:pPr>
+      <w:r>
+        <w:rPr>
+          <w:rFonts w:ascii="Times New Roman" w:hAnsi="Times New Roman" w:cs="Times New Roman"/>
+          <w:lang w:val="es-AR"/>
+        </w:rPr>
+        <w:t xml:space="preserve">Pasar todo a mayúsculas/minúsculas: </w:t>
+      </w:r>
+      <w:proofErr w:type="gramStart"/>
+      <w:r>
+        <w:rPr>
+          <w:rFonts w:ascii="Times New Roman" w:hAnsi="Times New Roman" w:cs="Times New Roman"/>
+          <w:lang w:val="es-AR"/>
+        </w:rPr>
+        <w:t>UPPER(</w:t>
+      </w:r>
+      <w:proofErr w:type="gramEnd"/>
+      <w:r>
+        <w:rPr>
+          <w:rFonts w:ascii="Times New Roman" w:hAnsi="Times New Roman" w:cs="Times New Roman"/>
+          <w:lang w:val="es-AR"/>
+        </w:rPr>
+        <w:t>) / LOWER().</w:t>
+      </w:r>
+    </w:p>
+    <w:p>
+      <w:pPr>
+        <w:pStyle w:val="Prrafodelista"/>
+        <w:numPr>
+          <w:ilvl w:val="0"/>
+          <w:numId w:val="7"/>
+        </w:numPr>
+        <w:spacing w:after="0" w:line="360" w:lineRule="auto"/>
+        <w:jc w:val="both"/>
+        <w:rPr>
+          <w:rFonts w:ascii="Times New Roman" w:hAnsi="Times New Roman" w:cs="Times New Roman"/>
+          <w:lang w:val="es-AR"/>
+        </w:rPr>
+      </w:pPr>
+      <w:r>
+        <w:rPr>
+          <w:rFonts w:ascii="Times New Roman" w:hAnsi="Times New Roman" w:cs="Times New Roman"/>
+          <w:lang w:val="es-AR"/>
+        </w:rPr>
+        <w:t>Corregir emails inválidos</w:t>
+      </w:r>
+    </w:p>
+    <w:p>
+      <w:pPr>
+        <w:pStyle w:val="Prrafodelista"/>
+        <w:numPr>
+          <w:ilvl w:val="0"/>
+          <w:numId w:val="7"/>
+        </w:numPr>
+        <w:spacing w:after="0" w:line="360" w:lineRule="auto"/>
+        <w:jc w:val="both"/>
+        <w:rPr>
+          <w:rFonts w:ascii="Times New Roman" w:hAnsi="Times New Roman" w:cs="Times New Roman"/>
+          <w:lang w:val="es-AR"/>
+        </w:rPr>
+      </w:pPr>
+      <w:r>
+        <w:rPr>
+          <w:rFonts w:ascii="Times New Roman" w:hAnsi="Times New Roman" w:cs="Times New Roman"/>
+          <w:lang w:val="es-AR"/>
+        </w:rPr>
+        <w:t>Eliminar registros sin email.</w:t>
+      </w:r>
+    </w:p>
+    <w:p>
+      <w:pPr>
+        <w:pStyle w:val="Prrafodelista"/>
+        <w:numPr>
+          <w:ilvl w:val="0"/>
+          <w:numId w:val="7"/>
+        </w:numPr>
+        <w:spacing w:after="0" w:line="360" w:lineRule="auto"/>
+        <w:jc w:val="both"/>
+        <w:rPr>
+          <w:rFonts w:ascii="Times New Roman" w:hAnsi="Times New Roman" w:cs="Times New Roman"/>
+          <w:lang w:val="es-AR"/>
+        </w:rPr>
+      </w:pPr>
+      <w:r>
+        <w:rPr>
+          <w:rFonts w:ascii="Times New Roman" w:hAnsi="Times New Roman" w:cs="Times New Roman"/>
+          <w:lang w:val="es-AR"/>
+        </w:rPr>
+        <w:t>Extraer solo números del teléfono.</w:t>
+      </w:r>
+    </w:p>
+    <w:p>
+      <w:pPr>
+        <w:pStyle w:val="Prrafodelista"/>
+        <w:numPr>
+          <w:ilvl w:val="0"/>
+          <w:numId w:val="7"/>
+        </w:numPr>
+        <w:spacing w:after="0" w:line="360" w:lineRule="auto"/>
+        <w:jc w:val="both"/>
+        <w:rPr>
+          <w:rFonts w:ascii="Times New Roman" w:hAnsi="Times New Roman" w:cs="Times New Roman"/>
+          <w:lang w:val="es-AR"/>
+        </w:rPr>
+      </w:pPr>
+      <w:r>
+        <w:rPr>
+          <w:rFonts w:ascii="Times New Roman" w:hAnsi="Times New Roman" w:cs="Times New Roman"/>
+          <w:lang w:val="es-AR"/>
+        </w:rPr>
+        <w:t>Detectar edades inválidas.</w:t>
+      </w:r>
+    </w:p>
+    <w:p>
+      <w:pPr>
+        <w:pStyle w:val="Prrafodelista"/>
+        <w:numPr>
+          <w:ilvl w:val="0"/>
+          <w:numId w:val="7"/>
+        </w:numPr>
+        <w:spacing w:after="0" w:line="360" w:lineRule="auto"/>
+        <w:jc w:val="both"/>
+        <w:rPr>
+          <w:rFonts w:ascii="Times New Roman" w:hAnsi="Times New Roman" w:cs="Times New Roman"/>
+          <w:lang w:val="es-AR"/>
+        </w:rPr>
+      </w:pPr>
+      <w:r>
+        <w:rPr>
+          <w:rFonts w:ascii="Times New Roman" w:hAnsi="Times New Roman" w:cs="Times New Roman"/>
+          <w:lang w:val="es-AR"/>
+        </w:rPr>
+        <w:t>Convertir fechas a formato DATE.</w:t>
+      </w:r>
+    </w:p>
+    <w:p>
+      <w:pPr>
+        <w:pStyle w:val="Prrafodelista"/>
+        <w:numPr>
+          <w:ilvl w:val="0"/>
+          <w:numId w:val="7"/>
+        </w:numPr>
+        <w:spacing w:after="0" w:line="360" w:lineRule="auto"/>
+        <w:jc w:val="both"/>
+        <w:rPr>
+          <w:rFonts w:ascii="Times New Roman" w:hAnsi="Times New Roman" w:cs="Times New Roman"/>
+          <w:lang w:val="es-AR"/>
+        </w:rPr>
+      </w:pPr>
+      <w:r>
+        <w:rPr>
+          <w:rFonts w:ascii="Times New Roman" w:hAnsi="Times New Roman" w:cs="Times New Roman"/>
+          <w:lang w:val="es-AR"/>
+        </w:rPr>
+        <w:t>Identificar fechas inválidas.</w:t>
+      </w:r>
+      <w:bookmarkStart w:id="0" w:name="_GoBack"/>
+      <w:bookmarkEnd w:id="0"/>
+    </w:p>
+    <w:p>
+      <w:pPr>
+        <w:pStyle w:val="Prrafodelista"/>
+        <w:numPr>
+          <w:ilvl w:val="0"/>
+          <w:numId w:val="7"/>
+        </w:numPr>
+        <w:spacing w:after="0" w:line="360" w:lineRule="auto"/>
+        <w:jc w:val="both"/>
+        <w:rPr>
+          <w:rFonts w:ascii="Times New Roman" w:hAnsi="Times New Roman" w:cs="Times New Roman"/>
+          <w:lang w:val="es-AR"/>
+        </w:rPr>
+      </w:pPr>
+      <w:r>
+        <w:rPr>
+          <w:rFonts w:ascii="Times New Roman" w:hAnsi="Times New Roman" w:cs="Times New Roman"/>
+          <w:lang w:val="es-AR"/>
+        </w:rPr>
+        <w:t>Normalizar nombres.</w:t>
+      </w:r>
+    </w:p>
+    <w:p>
+      <w:pPr>
+        <w:spacing w:after="0" w:line="360" w:lineRule="auto"/>
+        <w:jc w:val="both"/>
+        <w:rPr>
+          <w:rFonts w:ascii="Times New Roman" w:hAnsi="Times New Roman" w:cs="Times New Roman"/>
+          <w:lang w:val="es-AR"/>
+        </w:rPr>
+      </w:pPr>
+    </w:p>
+    <w:p>
+      <w:pPr>
+        <w:pStyle w:val="Prrafodelista"/>
+        <w:numPr>
+          <w:ilvl w:val="0"/>
+          <w:numId w:val="7"/>
+        </w:numPr>
+        <w:spacing w:after="0" w:line="360" w:lineRule="auto"/>
+        <w:jc w:val="both"/>
+        <w:rPr>
+          <w:rFonts w:ascii="Times New Roman" w:hAnsi="Times New Roman" w:cs="Times New Roman"/>
+          <w:lang w:val="es-AR"/>
+        </w:rPr>
+      </w:pPr>
+      <w:r>
+        <w:rPr>
+          <w:rFonts w:ascii="Times New Roman" w:hAnsi="Times New Roman" w:cs="Times New Roman"/>
+          <w:lang w:val="es-AR"/>
+        </w:rPr>
+        <w:lastRenderedPageBreak/>
+        <w:t>Rellenar edades faltantes.</w:t>
+      </w:r>
+    </w:p>
+    <w:p>
+      <w:pPr>
+        <w:spacing w:after="0" w:line="360" w:lineRule="auto"/>
+        <w:jc w:val="both"/>
+        <w:rPr>
+          <w:rFonts w:ascii="Times New Roman" w:hAnsi="Times New Roman" w:cs="Times New Roman"/>
+          <w:lang w:val="es-AR"/>
+        </w:rPr>
+      </w:pPr>
+    </w:p>
+    <w:p>
+      <w:pPr>
+        <w:pStyle w:val="Prrafodelista"/>
+        <w:numPr>
+          <w:ilvl w:val="0"/>
+          <w:numId w:val="7"/>
+        </w:numPr>
+        <w:spacing w:after="0" w:line="360" w:lineRule="auto"/>
+        <w:jc w:val="both"/>
+        <w:rPr>
+          <w:rFonts w:ascii="Times New Roman" w:hAnsi="Times New Roman" w:cs="Times New Roman"/>
+          <w:lang w:val="es-AR"/>
+        </w:rPr>
+      </w:pPr>
+      <w:r>
+        <w:rPr>
+          <w:rFonts w:ascii="Times New Roman" w:hAnsi="Times New Roman" w:cs="Times New Roman"/>
+          <w:lang w:val="es-AR"/>
+        </w:rPr>
+        <w:t>Eliminar filas donde todo está mal.</w:t>
       </w:r>
     </w:p>
     <w:sectPr>
@@ -4050,7 +4425,7 @@
   <w:abstractNum w:abstractNumId="6" w15:restartNumberingAfterBreak="0">
     <w:nsid w:val="1EE5780C"/>
     <w:multiLevelType w:val="hybridMultilevel"/>
-    <w:tmpl w:val="5A4A3C6C"/>
+    <w:tmpl w:val="A1D6202A"/>
     <w:lvl w:ilvl="0" w:tplc="04090001">
       <w:start w:val="1"/>
       <w:numFmt w:val="bullet"/>

</xml_diff>